<commit_message>
freshqr: ML Kit model-indirme bayrağı + sonuç ekranında okuyucu göstergesi; baskı testi kenar kırpma hatası düzeltildi
- AndroidManifest.xml: com.google.mlkit.vision.DEPENDENCIES bayrağı eklendi
  (gerçek cihaz #4 teşhisi için deneme — Play Store dışı sideload kurulumda
  etkisiz çıktı, ama Play Store kurulumları için doğru/gerekli).
- result_view.dart / user_screen.dart: sonuç ekranına "Okuyucu: ML Kit /
  zxing2 (yedek)" satırı eklendi — kamera taramasında hangi decoder'ın
  bulduğu artık ekranda görülebiliyor (gerçek cihazda ML Kit'in sessizce
  çökmesi/zxing2'ye düşmesi kullanıcı tarafından ayırt edilemiyordu).
- build_print_test_docx_v2.py: varsayılan Word kenar boşluklarıyla sütun
  genişliği (~5.08cm) B/C'nin gömme boyutundan (~5.55cm) küçük kalıyor,
  baskıda B/C'nin kenarları kırpılıyordu. Kenar boşukları daraltıldı
  (1.27cm) ve sütun genişliği açıkça 6.3cm'e sabitlendi. Baski_Testi_v2_ABC.docx
  yeniden üretildi.

Co-Authored-By: Claude Sonnet 5 <noreply@anthropic.com>
</commit_message>
<xml_diff>
--- a/tests/device/Baski_Testi_v2_ABC.docx
+++ b/tests/device/Baski_Testi_v2_ABC.docx
@@ -9,14 +9,14 @@
         <w:tblLook w:firstColumn="1" w:firstRow="1" w:lastColumn="0" w:lastRow="0" w:noHBand="0" w:noVBand="1" w:val="04A0"/>
       </w:tblPr>
       <w:tblGrid>
-        <w:gridCol w:w="2880"/>
-        <w:gridCol w:w="2880"/>
-        <w:gridCol w:w="2880"/>
+        <w:gridCol w:w="3572"/>
+        <w:gridCol w:w="3572"/>
+        <w:gridCol w:w="3572"/>
       </w:tblGrid>
       <w:tr>
         <w:tc>
           <w:tcPr>
-            <w:tcW w:type="dxa" w:w="2880"/>
+            <w:tcW w:type="dxa" w:w="3572"/>
           </w:tcPr>
           <w:p>
             <w:pPr>
@@ -33,7 +33,7 @@
         </w:tc>
         <w:tc>
           <w:tcPr>
-            <w:tcW w:type="dxa" w:w="2880"/>
+            <w:tcW w:type="dxa" w:w="3572"/>
           </w:tcPr>
           <w:p>
             <w:pPr>
@@ -50,7 +50,7 @@
         </w:tc>
         <w:tc>
           <w:tcPr>
-            <w:tcW w:type="dxa" w:w="2880"/>
+            <w:tcW w:type="dxa" w:w="3572"/>
           </w:tcPr>
           <w:p>
             <w:pPr>
@@ -69,7 +69,7 @@
       <w:tr>
         <w:tc>
           <w:tcPr>
-            <w:tcW w:type="dxa" w:w="2880"/>
+            <w:tcW w:type="dxa" w:w="3572"/>
           </w:tcPr>
           <w:p>
             <w:pPr>
@@ -113,7 +113,7 @@
         </w:tc>
         <w:tc>
           <w:tcPr>
-            <w:tcW w:type="dxa" w:w="2880"/>
+            <w:tcW w:type="dxa" w:w="3572"/>
           </w:tcPr>
           <w:p>
             <w:pPr>
@@ -157,7 +157,7 @@
         </w:tc>
         <w:tc>
           <w:tcPr>
-            <w:tcW w:type="dxa" w:w="2880"/>
+            <w:tcW w:type="dxa" w:w="3572"/>
           </w:tcPr>
           <w:p>
             <w:pPr>
@@ -209,14 +209,14 @@
         <w:tblLook w:firstColumn="1" w:firstRow="1" w:lastColumn="0" w:lastRow="0" w:noHBand="0" w:noVBand="1" w:val="04A0"/>
       </w:tblPr>
       <w:tblGrid>
-        <w:gridCol w:w="2880"/>
-        <w:gridCol w:w="2880"/>
-        <w:gridCol w:w="2880"/>
+        <w:gridCol w:w="3572"/>
+        <w:gridCol w:w="3572"/>
+        <w:gridCol w:w="3572"/>
       </w:tblGrid>
       <w:tr>
         <w:tc>
           <w:tcPr>
-            <w:tcW w:type="dxa" w:w="2880"/>
+            <w:tcW w:type="dxa" w:w="3572"/>
           </w:tcPr>
           <w:p>
             <w:pPr>
@@ -233,7 +233,7 @@
         </w:tc>
         <w:tc>
           <w:tcPr>
-            <w:tcW w:type="dxa" w:w="2880"/>
+            <w:tcW w:type="dxa" w:w="3572"/>
           </w:tcPr>
           <w:p>
             <w:pPr>
@@ -250,7 +250,7 @@
         </w:tc>
         <w:tc>
           <w:tcPr>
-            <w:tcW w:type="dxa" w:w="2880"/>
+            <w:tcW w:type="dxa" w:w="3572"/>
           </w:tcPr>
           <w:p>
             <w:pPr>
@@ -269,7 +269,7 @@
       <w:tr>
         <w:tc>
           <w:tcPr>
-            <w:tcW w:type="dxa" w:w="2880"/>
+            <w:tcW w:type="dxa" w:w="3572"/>
           </w:tcPr>
           <w:p>
             <w:pPr>
@@ -313,7 +313,7 @@
         </w:tc>
         <w:tc>
           <w:tcPr>
-            <w:tcW w:type="dxa" w:w="2880"/>
+            <w:tcW w:type="dxa" w:w="3572"/>
           </w:tcPr>
           <w:p>
             <w:pPr>
@@ -357,7 +357,7 @@
         </w:tc>
         <w:tc>
           <w:tcPr>
-            <w:tcW w:type="dxa" w:w="2880"/>
+            <w:tcW w:type="dxa" w:w="3572"/>
           </w:tcPr>
           <w:p>
             <w:pPr>
@@ -409,14 +409,14 @@
         <w:tblLook w:firstColumn="1" w:firstRow="1" w:lastColumn="0" w:lastRow="0" w:noHBand="0" w:noVBand="1" w:val="04A0"/>
       </w:tblPr>
       <w:tblGrid>
-        <w:gridCol w:w="2880"/>
-        <w:gridCol w:w="2880"/>
-        <w:gridCol w:w="2880"/>
+        <w:gridCol w:w="3572"/>
+        <w:gridCol w:w="3572"/>
+        <w:gridCol w:w="3572"/>
       </w:tblGrid>
       <w:tr>
         <w:tc>
           <w:tcPr>
-            <w:tcW w:type="dxa" w:w="2880"/>
+            <w:tcW w:type="dxa" w:w="3572"/>
           </w:tcPr>
           <w:p>
             <w:pPr>
@@ -433,7 +433,7 @@
         </w:tc>
         <w:tc>
           <w:tcPr>
-            <w:tcW w:type="dxa" w:w="2880"/>
+            <w:tcW w:type="dxa" w:w="3572"/>
           </w:tcPr>
           <w:p>
             <w:pPr>
@@ -450,7 +450,7 @@
         </w:tc>
         <w:tc>
           <w:tcPr>
-            <w:tcW w:type="dxa" w:w="2880"/>
+            <w:tcW w:type="dxa" w:w="3572"/>
           </w:tcPr>
           <w:p>
             <w:pPr>
@@ -469,7 +469,7 @@
       <w:tr>
         <w:tc>
           <w:tcPr>
-            <w:tcW w:type="dxa" w:w="2880"/>
+            <w:tcW w:type="dxa" w:w="3572"/>
           </w:tcPr>
           <w:p>
             <w:pPr>
@@ -513,7 +513,7 @@
         </w:tc>
         <w:tc>
           <w:tcPr>
-            <w:tcW w:type="dxa" w:w="2880"/>
+            <w:tcW w:type="dxa" w:w="3572"/>
           </w:tcPr>
           <w:p>
             <w:pPr>
@@ -557,7 +557,7 @@
         </w:tc>
         <w:tc>
           <w:tcPr>
-            <w:tcW w:type="dxa" w:w="2880"/>
+            <w:tcW w:type="dxa" w:w="3572"/>
           </w:tcPr>
           <w:p>
             <w:pPr>
@@ -604,7 +604,7 @@
     <w:p/>
     <w:sectPr>
       <w:pgSz w:w="12240" w:h="15840"/>
-      <w:pgMar w:top="1440" w:right="1800" w:bottom="1440" w:left="1800" w:header="720" w:footer="720" w:gutter="0"/>
+      <w:pgMar w:top="1440" w:right="720" w:bottom="1440" w:left="720" w:header="720" w:footer="720" w:gutter="0"/>
       <w:cols w:space="720"/>
       <w:docGrid w:linePitch="360"/>
     </w:sectPr>

</xml_diff>